<commit_message>
Entorno Servidor UT3: ejercicios de arrays y bucles resueltos
Anade en Arrays/ cuatro tareas con enunciado y solucion.php (arrays y tablas, bucle for, bucles anidados y formulario con select), mas el PDF de referencia de andros.dev.

Entorno Cliente: incorpora el apartado 1.6 a los apuntes y crea un resumen teorico de la Unidad 1 para examen, con 64 preguntas trampa resueltas.
</commit_message>
<xml_diff>
--- a/Entorno Cliente/Apuntes/Apuntes_Unidad1_Clientes_Web.docx
+++ b/Entorno Cliente/Apuntes/Apuntes_Unidad1_Clientes_Web.docx
@@ -263,6 +263,14 @@
       </w:pPr>
       <w:r>
         <w:t xml:space="preserve">16. Actividades del apartado 1.5</w:t>
+      </w:r>
+    </w:p>
+    <w:p>
+      <w:pPr>
+        <w:ind w:left="400"/>
+      </w:pPr>
+      <w:r>
+        <w:t>17. Herramientas de programacion y prueba (apartado 1.6)</w:t>
       </w:r>
     </w:p>
     <w:p>
@@ -31120,6 +31128,1397 @@
     <w:p>
       <w:pPr>
         <w:pStyle w:val="Heading1"/>
+      </w:pPr>
+      <w:r>
+        <w:t>17. Herramientas de programacion y prueba sobre clientes web (apartado 1.6)</w:t>
+      </w:r>
+    </w:p>
+    <w:p>
+      <w:pPr>
+        <w:jc w:val="both"/>
+      </w:pPr>
+      <w:r>
+        <w:rPr>
+          <w:b/>
+        </w:rPr>
+        <w:t xml:space="preserve">Resultado de Aprendizaje Asociado: </w:t>
+      </w:r>
+      <w:r>
+        <w:t>RA1 (Selecciona las arquitecturas y tecnologias de programacion sobre clientes Web, identificando y analizando las capacidades y caracteristicas de cada una).</w:t>
+      </w:r>
+    </w:p>
+    <w:p>
+      <w:pPr>
+        <w:jc w:val="both"/>
+      </w:pPr>
+      <w:r>
+        <w:rPr>
+          <w:b/>
+        </w:rPr>
+        <w:t xml:space="preserve">Criterio Curricular Oficial: </w:t>
+      </w:r>
+      <w:r>
+        <w:t>CE 1.f (Se han reconocido y evaluado las herramientas de programacion y prueba sobre clientes web).</w:t>
+      </w:r>
+    </w:p>
+    <w:p>
+      <w:pPr>
+        <w:jc w:val="both"/>
+      </w:pPr>
+      <w:r>
+        <w:rPr>
+          <w:b/>
+        </w:rPr>
+        <w:t xml:space="preserve">Ponderacion del criterio: </w:t>
+      </w:r>
+      <w:r>
+        <w:t>16,67% del RA1 | 0,833% sobre la calificacion final del modulo.</w:t>
+      </w:r>
+    </w:p>
+    <w:p>
+      <w:pPr>
+        <w:jc w:val="both"/>
+      </w:pPr>
+      <w:r/>
+    </w:p>
+    <w:p>
+      <w:pPr>
+        <w:jc w:val="both"/>
+      </w:pPr>
+      <w:r>
+        <w:t>El desarrollo profesional en JavaScript requiere superar el uso de editores de texto elementales y adoptar entornos de trabajo que integren asistentes de codigo, depuradores interactivos, gestores de dependencias y sistemas de control de versiones. El tecnico en desarrollo de aplicaciones web debe evaluar y seleccionar las herramientas adecuadas en funcion de la envergadura del proyecto, la infraestructura disponible y el flujo de trabajo en equipo.</w:t>
+      </w:r>
+    </w:p>
+    <w:p>
+      <w:pPr>
+        <w:pStyle w:val="Heading2"/>
+      </w:pPr>
+      <w:r>
+        <w:t>17.1 A. Herramientas locales: de editores basicos a IDEs avanzados</w:t>
+      </w:r>
+    </w:p>
+    <w:p>
+      <w:pPr>
+        <w:jc w:val="both"/>
+      </w:pPr>
+      <w:r>
+        <w:t>Para escribir codigo JavaScript es tecnicamente suficiente un editor de texto plano sin formato (como Notepad en Windows o gedit en Linux). Sin embargo, en un entorno de desarrollo empresarial esta practica es inviable debido a la falta de herramientas que automaticen la verificacion de la sintaxis y la gestion de proyectos.</w:t>
+      </w:r>
+    </w:p>
+    <w:p>
+      <w:pPr>
+        <w:jc w:val="both"/>
+      </w:pPr>
+      <w:r>
+        <w:rPr>
+          <w:b/>
+        </w:rPr>
+        <w:t xml:space="preserve">Ranking de editores top para JavaScript / TypeScript </w:t>
+      </w:r>
+      <w:r>
+        <w:t>(encuesta global Stack Overflow Developer Survey):</w:t>
+      </w:r>
+    </w:p>
+    <w:p>
+      <w:pPr>
+        <w:ind w:left="400"/>
+        <w:jc w:val="both"/>
+      </w:pPr>
+      <w:r>
+        <w:t xml:space="preserve">- </w:t>
+      </w:r>
+      <w:r>
+        <w:rPr>
+          <w:b/>
+        </w:rPr>
+        <w:t xml:space="preserve">1. Visual Studio Code (75,9% de uso global). </w:t>
+      </w:r>
+      <w:r>
+        <w:t>Estandar absoluto de la industria: mas del 80% de los desarrolladores frontend lo tienen como herramienta principal. Cuenta con soporte nativo de fabrica para TypeScript (el propio editor esta programado en TypeScript) y extensiones de ecosistema como ESLint, Prettier y los React/Vue Snippets.</w:t>
+      </w:r>
+    </w:p>
+    <w:p>
+      <w:pPr>
+        <w:ind w:left="400"/>
+        <w:jc w:val="both"/>
+      </w:pPr>
+      <w:r>
+        <w:t xml:space="preserve">- </w:t>
+      </w:r>
+      <w:r>
+        <w:rPr>
+          <w:b/>
+        </w:rPr>
+        <w:t xml:space="preserve">2. Notepad++ (27,4%). </w:t>
+      </w:r>
+      <w:r>
+        <w:t>No es un entorno para armar una aplicacion moderna compleja (tipo Next.js), pero sigue apareciendo muy alto porque se usa en Windows para edicion rapida de scripts sueltos, manipulacion veloz de archivos .json gigantes o tareas ligeras de automatizacion.</w:t>
+      </w:r>
+    </w:p>
+    <w:p>
+      <w:pPr>
+        <w:ind w:left="400"/>
+        <w:jc w:val="both"/>
+      </w:pPr>
+      <w:r>
+        <w:t xml:space="preserve">- </w:t>
+      </w:r>
+      <w:r>
+        <w:rPr>
+          <w:b/>
+        </w:rPr>
+        <w:t xml:space="preserve">3. Vim / Neovim (38,3% combinado: Vim 24,3% y Neovim 14%). </w:t>
+      </w:r>
+      <w:r>
+        <w:t>El entorno favorito de los desarrolladores avanzados y administradores de servidores: con Neovim se consigue el mismo autocompletado y tipado inteligente de TypeScript que ofrece VS Code, pero corriendo en la terminal a maxima velocidad.</w:t>
+      </w:r>
+    </w:p>
+    <w:p>
+      <w:pPr>
+        <w:ind w:left="400"/>
+        <w:jc w:val="both"/>
+      </w:pPr>
+      <w:r>
+        <w:t xml:space="preserve">- </w:t>
+      </w:r>
+      <w:r>
+        <w:rPr>
+          <w:b/>
+        </w:rPr>
+        <w:t xml:space="preserve">4. Cursor (17,9% y subiendo). </w:t>
+      </w:r>
+      <w:r>
+        <w:t>La herramienta de IA que mas rapido ha escalado en los rankings. Al ser un clon exacto de VS Code, se ha vuelto popular entre los desarrolladores de JavaScript porque permite usar IA nativa para generar componentes interactivos completos de interfaces web o refactorizar archivos TypeScript complejos en lenguaje natural.</w:t>
+      </w:r>
+    </w:p>
+    <w:p>
+      <w:pPr>
+        <w:ind w:left="400"/>
+        <w:jc w:val="both"/>
+      </w:pPr>
+      <w:r>
+        <w:t xml:space="preserve">- </w:t>
+      </w:r>
+      <w:r>
+        <w:rPr>
+          <w:b/>
+        </w:rPr>
+        <w:t xml:space="preserve">5. IDEs de JetBrains (15,1% combinados; WebStorm 7,6%). </w:t>
+      </w:r>
+      <w:r>
+        <w:t>WebStorm es considerado el Rolls-Royce de los IDEs para JavaScript. Su porcentaje global parece menor porque es una herramienta tradicionalmente comercial de pago, aunque JetBrains ha liberado una version gratuita para uso no comercial. Su motor de refactorizacion y deteccion de rutas rotas es el mas inteligente y seguro del mercado.</w:t>
+      </w:r>
+    </w:p>
+    <w:p>
+      <w:pPr>
+        <w:jc w:val="both"/>
+      </w:pPr>
+      <w:r>
+        <w:rPr>
+          <w:b/>
+        </w:rPr>
+        <w:t xml:space="preserve">La relacion entre VS Code y VSCodium. </w:t>
+      </w:r>
+      <w:r>
+        <w:t>Aunque ambos se ven y actuan de forma identica, la diferencia esta en la privacidad y la licencia de distribucion:</w:t>
+      </w:r>
+    </w:p>
+    <w:p>
+      <w:pPr>
+        <w:ind w:left="400"/>
+        <w:jc w:val="both"/>
+      </w:pPr>
+      <w:r>
+        <w:t xml:space="preserve">- </w:t>
+      </w:r>
+      <w:r>
+        <w:rPr>
+          <w:b/>
+        </w:rPr>
+        <w:t xml:space="preserve">Visual Studio Code (propiedad de Microsoft). </w:t>
+      </w:r>
+      <w:r>
+        <w:t>El codigo fuente base es libre (Code - OSS), pero el instalador final que descargas de Microsoft incluye una licencia comercial. Contiene telemetria (rastreadores que envian datos de uso a Microsoft) y restricciones para usar ciertas extensiones oficiales en otros editores.</w:t>
+      </w:r>
+    </w:p>
+    <w:p>
+      <w:pPr>
+        <w:ind w:left="400"/>
+        <w:jc w:val="both"/>
+      </w:pPr>
+      <w:r>
+        <w:t xml:space="preserve">- </w:t>
+      </w:r>
+      <w:r>
+        <w:rPr>
+          <w:b/>
+        </w:rPr>
+        <w:t xml:space="preserve">VSCodium (100% libre y comunitario). </w:t>
+      </w:r>
+      <w:r>
+        <w:t>Proyecto independiente que toma exactamente el mismo codigo fuente libre de Microsoft y lo compila de forma limpia: elimina por completo la telemetria, el rastreo de datos y las licencias comerciales. Es la opcion preferida por los defensores del software libre y la privacidad extrema.</w:t>
+      </w:r>
+    </w:p>
+    <w:p>
+      <w:pPr>
+        <w:jc w:val="both"/>
+      </w:pPr>
+      <w:r>
+        <w:rPr>
+          <w:b/>
+        </w:rPr>
+        <w:t>Editores independientes con IA nativa</w:t>
+      </w:r>
+      <w:r>
+        <w:t>:</w:t>
+      </w:r>
+    </w:p>
+    <w:p>
+      <w:pPr>
+        <w:ind w:left="400"/>
+        <w:jc w:val="both"/>
+      </w:pPr>
+      <w:r>
+        <w:t xml:space="preserve">- </w:t>
+      </w:r>
+      <w:r>
+        <w:rPr>
+          <w:b/>
+        </w:rPr>
+        <w:t xml:space="preserve">Windsurf (de Codeium). </w:t>
+      </w:r>
+      <w:r>
+        <w:t>Es el competidor mas fuerte y directo de Cursor. Al igual que este, es un clon (fork) de VS Code, por lo que mantiene la misma interfaz y compatibilidad con las extensiones. Destaca su modo agente llamado Cascade, capaz de analizar de forma autonoma bases de codigo complejas, ejecutar comandos en la terminal, leer errores y corregir bugs. Plan gratuito muy generoso.</w:t>
+      </w:r>
+    </w:p>
+    <w:p>
+      <w:pPr>
+        <w:ind w:left="400"/>
+        <w:jc w:val="both"/>
+      </w:pPr>
+      <w:r>
+        <w:t xml:space="preserve">- </w:t>
+      </w:r>
+      <w:r>
+        <w:rPr>
+          <w:b/>
+        </w:rPr>
+        <w:t xml:space="preserve">Void. </w:t>
+      </w:r>
+      <w:r>
+        <w:t>Alternativa 100% de codigo abierto construida por la comunidad para competir contra el modelo comercial cerrado de Cursor. Su enfoque es la privacidad total: se conectan claves de API propias (OpenAI, Anthropic, Gemini) o modelos de IA locales en el propio equipo.</w:t>
+      </w:r>
+    </w:p>
+    <w:p>
+      <w:pPr>
+        <w:ind w:left="400"/>
+        <w:jc w:val="both"/>
+      </w:pPr>
+      <w:r>
+        <w:t xml:space="preserve">- </w:t>
+      </w:r>
+      <w:r>
+        <w:rPr>
+          <w:b/>
+        </w:rPr>
+        <w:t xml:space="preserve">Zed. </w:t>
+      </w:r>
+      <w:r>
+        <w:t>Editor de rendimiento extremo escrito en Rust, que no consume apenas RAM y usa la GPU. Gratuito y de codigo abierto, con IA integrada de forma nativa en su interfaz grafica configurando la propia API Key.</w:t>
+      </w:r>
+    </w:p>
+    <w:p>
+      <w:pPr>
+        <w:jc w:val="both"/>
+      </w:pPr>
+      <w:r>
+        <w:rPr>
+          <w:b/>
+        </w:rPr>
+        <w:t>Caracteristicas tecnicas fundamentales para elegir un entorno profesional</w:t>
+      </w:r>
+      <w:r>
+        <w:t>:</w:t>
+      </w:r>
+    </w:p>
+    <w:p>
+      <w:pPr>
+        <w:ind w:left="400"/>
+        <w:jc w:val="both"/>
+      </w:pPr>
+      <w:r>
+        <w:t xml:space="preserve">- </w:t>
+      </w:r>
+      <w:r>
+        <w:t>Codigo abierto (open-source) y gratuidad: garantiza que la comunidad audite el codigo, reporte fallos y publique mejoras de forma continua, resolviendo incidencias mas rapido que en aplicaciones proprietarias cerradas.</w:t>
+      </w:r>
+    </w:p>
+    <w:p>
+      <w:pPr>
+        <w:ind w:left="400"/>
+        <w:jc w:val="both"/>
+      </w:pPr>
+      <w:r>
+        <w:t xml:space="preserve">- </w:t>
+      </w:r>
+      <w:r>
+        <w:t>Arquitectura modular: permite activar, desactivar o reemplazar componentes internos del editor segun los gustos o necesidades del desarrollador.</w:t>
+      </w:r>
+    </w:p>
+    <w:p>
+      <w:pPr>
+        <w:ind w:left="400"/>
+        <w:jc w:val="both"/>
+      </w:pPr>
+      <w:r>
+        <w:t xml:space="preserve">- </w:t>
+      </w:r>
+      <w:r>
+        <w:t>Gestor de paquetes integrado: mecanismo de linea de comandos o interfaz visual para registrar, instalar, actualizar y eliminar librerias, extensiones y temas de forma desatendida.</w:t>
+      </w:r>
+    </w:p>
+    <w:p>
+      <w:pPr>
+        <w:ind w:left="400"/>
+        <w:jc w:val="both"/>
+      </w:pPr>
+      <w:r>
+        <w:t xml:space="preserve">- </w:t>
+      </w:r>
+      <w:r>
+        <w:t>Autocompletado predictivo: analiza las variables, funciones y metodos del lenguaje mientras se escribe, minimizando fallos tipograficos y acelerando la codificacion.</w:t>
+      </w:r>
+    </w:p>
+    <w:p>
+      <w:pPr>
+        <w:ind w:left="400"/>
+        <w:jc w:val="both"/>
+      </w:pPr>
+      <w:r>
+        <w:t xml:space="preserve">- </w:t>
+      </w:r>
+      <w:r>
+        <w:t>Sistema de paneles multiples: organizacion visual del espacio de trabajo en paneles divididos para editar a la vez HTML, CSS y JS.</w:t>
+      </w:r>
+    </w:p>
+    <w:p>
+      <w:pPr>
+        <w:ind w:left="400"/>
+        <w:jc w:val="both"/>
+      </w:pPr>
+      <w:r>
+        <w:t xml:space="preserve">- </w:t>
+      </w:r>
+      <w:r>
+        <w:t>Soporte y canales comunitarios: apoyo tecnico distribuido en foros y plataformas colaborativas como Slack o redes sociales.</w:t>
+      </w:r>
+    </w:p>
+    <w:p>
+      <w:pPr>
+        <w:pStyle w:val="Heading2"/>
+      </w:pPr>
+      <w:r>
+        <w:t>17.2 B. Integracion con sistemas de control de versiones (Git y GitHub)</w:t>
+      </w:r>
+    </w:p>
+    <w:p>
+      <w:pPr>
+        <w:jc w:val="both"/>
+      </w:pPr>
+      <w:r>
+        <w:t>El desarrollo en equipo exige registrar el historial de cambios, gestionar ramas de caracteristicas y coordinar modificaciones concurrentes:</w:t>
+      </w:r>
+    </w:p>
+    <w:p>
+      <w:pPr>
+        <w:ind w:left="400"/>
+        <w:jc w:val="both"/>
+      </w:pPr>
+      <w:r>
+        <w:t xml:space="preserve">- </w:t>
+      </w:r>
+      <w:r>
+        <w:rPr>
+          <w:b/>
+        </w:rPr>
+        <w:t xml:space="preserve">Git. </w:t>
+      </w:r>
+      <w:r>
+        <w:t>Sistema de control de versiones distribuido que rastrea cada modificacion realizada en los archivos del proyecto a lo largo del tiempo.</w:t>
+      </w:r>
+    </w:p>
+    <w:p>
+      <w:pPr>
+        <w:ind w:left="400"/>
+        <w:jc w:val="both"/>
+      </w:pPr>
+      <w:r>
+        <w:t xml:space="preserve">- </w:t>
+      </w:r>
+      <w:r>
+        <w:rPr>
+          <w:b/>
+        </w:rPr>
+        <w:t xml:space="preserve">GitHub. </w:t>
+      </w:r>
+      <w:r>
+        <w:t>Plataforma en la nube para alojar repositorios Git, facilitando la revision de codigo por pares (pull requests), el seguimiento de incidencias (issues) y la integracion continua.</w:t>
+      </w:r>
+    </w:p>
+    <w:p>
+      <w:pPr>
+        <w:ind w:left="400"/>
+        <w:jc w:val="both"/>
+      </w:pPr>
+      <w:r>
+        <w:t xml:space="preserve">- </w:t>
+      </w:r>
+      <w:r>
+        <w:rPr>
+          <w:b/>
+        </w:rPr>
+        <w:t xml:space="preserve">Integracion en el IDE. </w:t>
+      </w:r>
+      <w:r>
+        <w:t>Los editores como Visual Studio Code integran paneles nativos de Git que permiten confirmar cambios (commits), alternar entre ramas y resolver conflictos sin salir del entorno de edicion.</w:t>
+      </w:r>
+    </w:p>
+    <w:p>
+      <w:pPr>
+        <w:pStyle w:val="Heading2"/>
+      </w:pPr>
+      <w:r>
+        <w:t>17.3 C. Entornos de programacion y prueba online</w:t>
+      </w:r>
+    </w:p>
+    <w:p>
+      <w:pPr>
+        <w:jc w:val="both"/>
+      </w:pPr>
+      <w:r>
+        <w:t>Cuando se necesita probar fragmentos de codigo de forma inmediata sin configurar un entorno local, o cuando se trabaja desde dispositivos con restricciones de instalacion, los IDEs en la nube ofrecen una alternativa funcional:</w:t>
+      </w:r>
+    </w:p>
+    <w:p>
+      <w:pPr>
+        <w:ind w:left="400"/>
+        <w:jc w:val="both"/>
+      </w:pPr>
+      <w:r>
+        <w:t xml:space="preserve">- </w:t>
+      </w:r>
+      <w:r>
+        <w:rPr>
+          <w:b/>
+        </w:rPr>
+        <w:t xml:space="preserve">Coding Ground (Tutorialspoint). </w:t>
+      </w:r>
+      <w:r>
+        <w:t>Plataforma accesible via navegador web. Proporciona un editor con resaltado de sintaxis, visualizacion previa (Preview) y consola de ejecucion simultanea. Permite gestionar multiples ficheros dentro de un mismo proyecto, descargar el codigo generado al equipo local o importar archivos externos.</w:t>
+      </w:r>
+    </w:p>
+    <w:p>
+      <w:pPr>
+        <w:ind w:left="400"/>
+        <w:jc w:val="both"/>
+      </w:pPr>
+      <w:r>
+        <w:t xml:space="preserve">- </w:t>
+      </w:r>
+      <w:r>
+        <w:rPr>
+          <w:b/>
+        </w:rPr>
+        <w:t xml:space="preserve">Otras plataformas en la nube. </w:t>
+      </w:r>
+      <w:r>
+        <w:t>CodeSandbox, StackBlitz o JSFiddle permiten evaluar librerias y componentes sin requerir instalacion previa, y arrancar proyectos de React, Angular o Vue directamente desde el navegador en un par de segundos.</w:t>
+      </w:r>
+    </w:p>
+    <w:p>
+      <w:pPr>
+        <w:pStyle w:val="Heading2"/>
+      </w:pPr>
+      <w:r>
+        <w:t>17.4 D. Herramientas de prueba y depuracion del navegador (DevTools)</w:t>
+      </w:r>
+    </w:p>
+    <w:p>
+      <w:pPr>
+        <w:jc w:val="both"/>
+      </w:pPr>
+      <w:r>
+        <w:t>El navegador web integra su propio conjunto de herramientas de diagnostico tecnico, accesibles de forma universal pulsando la tecla F12 o mediante la combinacion Ctrl + Shift + I:</w:t>
+      </w:r>
+    </w:p>
+    <w:p>
+      <w:pPr>
+        <w:ind w:left="400"/>
+        <w:jc w:val="both"/>
+      </w:pPr>
+      <w:r>
+        <w:t xml:space="preserve">- </w:t>
+      </w:r>
+      <w:r>
+        <w:rPr>
+          <w:b/>
+        </w:rPr>
+        <w:t xml:space="preserve">Panel Consola (Console). </w:t>
+      </w:r>
+      <w:r>
+        <w:t>Permite interactuar directamente con el motor de JavaScript en tiempo real. Muestra las salidas emitidas mediante console.log() y resalta en color rojo las excepciones y errores no capturados durante la ejecucion.</w:t>
+      </w:r>
+    </w:p>
+    <w:p>
+      <w:pPr>
+        <w:ind w:left="400"/>
+        <w:jc w:val="both"/>
+      </w:pPr>
+      <w:r>
+        <w:t xml:space="preserve">- </w:t>
+      </w:r>
+      <w:r>
+        <w:rPr>
+          <w:b/>
+        </w:rPr>
+        <w:t xml:space="preserve">Panel Fuentes (Sources / Debugger). </w:t>
+      </w:r>
+      <w:r>
+        <w:t>Permite examinar los ficheros .js descargados y establecer puntos de interrupcion (breakpoints) en lineas concretas. Cuando la ejecucion alcanza un punto de interrupcion, el navegador congela el script para inspeccionar el valor de las variables en memoria paso a paso y analizar la pila de llamadas (Call Stack).</w:t>
+      </w:r>
+    </w:p>
+    <w:p>
+      <w:pPr>
+        <w:ind w:left="400"/>
+        <w:jc w:val="both"/>
+      </w:pPr>
+      <w:r>
+        <w:t xml:space="preserve">- </w:t>
+      </w:r>
+      <w:r>
+        <w:rPr>
+          <w:b/>
+        </w:rPr>
+        <w:t xml:space="preserve">Panel Red (Network). </w:t>
+      </w:r>
+      <w:r>
+        <w:t>Supervisa todas las peticiones HTTP que realiza la pagina (ficheros HTML, hojas de estilo CSS, scripts .js, imagenes o peticiones asincronas de datos). Permite comprobar el codigo de respuesta del servidor (200 OK, 404 Not Found, 500 Server Error), el tiempo exacto de transferencia y el tamano de los recursos descargados.</w:t>
+      </w:r>
+    </w:p>
+    <w:p>
+      <w:pPr>
+        <w:pStyle w:val="Heading2"/>
+      </w:pPr>
+      <w:r>
+        <w:t>17.5 E. Criterios de evaluacion y seleccion de herramientas</w:t>
+      </w:r>
+    </w:p>
+    <w:p>
+      <w:pPr>
+        <w:jc w:val="both"/>
+      </w:pPr>
+      <w:r>
+        <w:t>Para seleccionar el software de desarrollo en un proyecto web se aplican los siguientes factores tecnicos:</w:t>
+      </w:r>
+    </w:p>
+    <w:tbl>
+      <w:tblPr>
+        <w:tblW w:type="dxa" w:w="9638"/>
+        <w:tblBorders>
+          <w:top w:val="single" w:color="auto" w:sz="4"/>
+          <w:left w:val="single" w:color="auto" w:sz="4"/>
+          <w:bottom w:val="single" w:color="auto" w:sz="4"/>
+          <w:right w:val="single" w:color="auto" w:sz="4"/>
+          <w:insideH w:val="single" w:color="auto" w:sz="4"/>
+          <w:insideV w:val="single" w:color="auto" w:sz="4"/>
+        </w:tblBorders>
+      </w:tblPr>
+      <w:tblGrid>
+        <w:gridCol w:w="1900"/>
+        <w:gridCol w:w="5638"/>
+        <w:gridCol w:w="2100"/>
+      </w:tblGrid>
+      <w:tr>
+        <w:trPr>
+          <w:tblHeader/>
+        </w:trPr>
+        <w:tc>
+          <w:tcPr>
+            <w:tcW w:type="dxa" w:w="1900"/>
+            <w:tcBorders>
+              <w:top w:val="single" w:color="BFBFBF" w:sz="4"/>
+              <w:left w:val="single" w:color="BFBFBF" w:sz="4"/>
+              <w:bottom w:val="single" w:color="BFBFBF" w:sz="4"/>
+              <w:right w:val="single" w:color="BFBFBF" w:sz="4"/>
+            </w:tcBorders>
+            <w:shd w:fill="1F3864" w:val="clear"/>
+            <w:tcMar>
+              <w:top w:type="dxa" w:w="70"/>
+              <w:left w:type="dxa" w:w="110"/>
+              <w:bottom w:type="dxa" w:w="70"/>
+              <w:right w:type="dxa" w:w="110"/>
+            </w:tcMar>
+          </w:tcPr>
+          <w:p>
+            <w:r>
+              <w:rPr>
+                <w:b/>
+                <w:color w:val="FFFFFF"/>
+                <w:sz w:val="20"/>
+              </w:rPr>
+              <w:t>Parametro de decision</w:t>
+            </w:r>
+          </w:p>
+        </w:tc>
+        <w:tc>
+          <w:tcPr>
+            <w:tcW w:type="dxa" w:w="5638"/>
+            <w:tcBorders>
+              <w:top w:val="single" w:color="BFBFBF" w:sz="4"/>
+              <w:left w:val="single" w:color="BFBFBF" w:sz="4"/>
+              <w:bottom w:val="single" w:color="BFBFBF" w:sz="4"/>
+              <w:right w:val="single" w:color="BFBFBF" w:sz="4"/>
+            </w:tcBorders>
+            <w:shd w:fill="1F3864" w:val="clear"/>
+            <w:tcMar>
+              <w:top w:type="dxa" w:w="70"/>
+              <w:left w:type="dxa" w:w="110"/>
+              <w:bottom w:type="dxa" w:w="70"/>
+              <w:right w:type="dxa" w:w="110"/>
+            </w:tcMar>
+          </w:tcPr>
+          <w:p>
+            <w:r>
+              <w:rPr>
+                <w:b/>
+                <w:color w:val="FFFFFF"/>
+                <w:sz w:val="20"/>
+              </w:rPr>
+              <w:t>Editor ligero / Online</w:t>
+            </w:r>
+          </w:p>
+        </w:tc>
+        <w:tc>
+          <w:tcPr>
+            <w:tcW w:type="dxa" w:w="2100"/>
+            <w:tcBorders>
+              <w:top w:val="single" w:color="BFBFBF" w:sz="4"/>
+              <w:left w:val="single" w:color="BFBFBF" w:sz="4"/>
+              <w:bottom w:val="single" w:color="BFBFBF" w:sz="4"/>
+              <w:right w:val="single" w:color="BFBFBF" w:sz="4"/>
+            </w:tcBorders>
+            <w:shd w:fill="1F3864" w:val="clear"/>
+            <w:tcMar>
+              <w:top w:type="dxa" w:w="70"/>
+              <w:left w:type="dxa" w:w="110"/>
+              <w:bottom w:type="dxa" w:w="70"/>
+              <w:right w:type="dxa" w:w="110"/>
+            </w:tcMar>
+          </w:tcPr>
+          <w:p>
+            <w:r>
+              <w:rPr>
+                <w:b/>
+                <w:color w:val="FFFFFF"/>
+                <w:sz w:val="20"/>
+              </w:rPr>
+              <w:t>IDE completo / avanzado</w:t>
+            </w:r>
+          </w:p>
+        </w:tc>
+      </w:tr>
+      <w:tr>
+        <w:trPr>
+          <w:cantSplit/>
+        </w:trPr>
+        <w:tc>
+          <w:tcPr>
+            <w:tcW w:type="dxa" w:w="1900"/>
+            <w:tcBorders>
+              <w:top w:val="single" w:color="BFBFBF" w:sz="4"/>
+              <w:left w:val="single" w:color="BFBFBF" w:sz="4"/>
+              <w:bottom w:val="single" w:color="BFBFBF" w:sz="4"/>
+              <w:right w:val="single" w:color="BFBFBF" w:sz="4"/>
+            </w:tcBorders>
+            <w:shd w:fill="FFFFFF" w:val="clear"/>
+            <w:tcMar>
+              <w:top w:type="dxa" w:w="70"/>
+              <w:left w:type="dxa" w:w="110"/>
+              <w:bottom w:type="dxa" w:w="70"/>
+              <w:right w:type="dxa" w:w="110"/>
+            </w:tcMar>
+          </w:tcPr>
+          <w:p>
+            <w:r>
+              <w:rPr>
+                <w:sz w:val="20"/>
+              </w:rPr>
+              <w:t>Escenario de uso ideoneo</w:t>
+            </w:r>
+          </w:p>
+        </w:tc>
+        <w:tc>
+          <w:tcPr>
+            <w:tcW w:type="dxa" w:w="5638"/>
+            <w:tcBorders>
+              <w:top w:val="single" w:color="BFBFBF" w:sz="4"/>
+              <w:left w:val="single" w:color="BFBFBF" w:sz="4"/>
+              <w:bottom w:val="single" w:color="BFBFBF" w:sz="4"/>
+              <w:right w:val="single" w:color="BFBFBF" w:sz="4"/>
+            </w:tcBorders>
+            <w:shd w:fill="FFFFFF" w:val="clear"/>
+            <w:tcMar>
+              <w:top w:type="dxa" w:w="70"/>
+              <w:left w:type="dxa" w:w="110"/>
+              <w:bottom w:type="dxa" w:w="70"/>
+              <w:right w:type="dxa" w:w="110"/>
+            </w:tcMar>
+          </w:tcPr>
+          <w:p>
+            <w:r>
+              <w:rPr>
+                <w:sz w:val="20"/>
+              </w:rPr>
+              <w:t>Pruebas de concepto rapidas, correccion puntual de errores, equipos con hardware limitado.</w:t>
+            </w:r>
+          </w:p>
+        </w:tc>
+        <w:tc>
+          <w:tcPr>
+            <w:tcW w:type="dxa" w:w="2100"/>
+            <w:tcBorders>
+              <w:top w:val="single" w:color="BFBFBF" w:sz="4"/>
+              <w:left w:val="single" w:color="BFBFBF" w:sz="4"/>
+              <w:bottom w:val="single" w:color="BFBFBF" w:sz="4"/>
+              <w:right w:val="single" w:color="BFBFBF" w:sz="4"/>
+            </w:tcBorders>
+            <w:shd w:fill="FFFFFF" w:val="clear"/>
+            <w:tcMar>
+              <w:top w:type="dxa" w:w="70"/>
+              <w:left w:type="dxa" w:w="110"/>
+              <w:bottom w:type="dxa" w:w="70"/>
+              <w:right w:type="dxa" w:w="110"/>
+            </w:tcMar>
+          </w:tcPr>
+          <w:p>
+            <w:r>
+              <w:rPr>
+                <w:sz w:val="20"/>
+              </w:rPr>
+              <w:t>Proyectos profesionales medianos y grandes, aplicaciones basadas en frameworks (React, Angular).</w:t>
+            </w:r>
+          </w:p>
+        </w:tc>
+      </w:tr>
+      <w:tr>
+        <w:trPr>
+          <w:cantSplit/>
+        </w:trPr>
+        <w:tc>
+          <w:tcPr>
+            <w:tcW w:type="dxa" w:w="1900"/>
+            <w:tcBorders>
+              <w:top w:val="single" w:color="BFBFBF" w:sz="4"/>
+              <w:left w:val="single" w:color="BFBFBF" w:sz="4"/>
+              <w:bottom w:val="single" w:color="BFBFBF" w:sz="4"/>
+              <w:right w:val="single" w:color="BFBFBF" w:sz="4"/>
+            </w:tcBorders>
+            <w:shd w:fill="F7F9FC" w:val="clear"/>
+            <w:tcMar>
+              <w:top w:type="dxa" w:w="70"/>
+              <w:left w:type="dxa" w:w="110"/>
+              <w:bottom w:type="dxa" w:w="70"/>
+              <w:right w:type="dxa" w:w="110"/>
+            </w:tcMar>
+          </w:tcPr>
+          <w:p>
+            <w:r>
+              <w:rPr>
+                <w:sz w:val="20"/>
+              </w:rPr>
+              <w:t>Consumo de recursos</w:t>
+            </w:r>
+          </w:p>
+        </w:tc>
+        <w:tc>
+          <w:tcPr>
+            <w:tcW w:type="dxa" w:w="5638"/>
+            <w:tcBorders>
+              <w:top w:val="single" w:color="BFBFBF" w:sz="4"/>
+              <w:left w:val="single" w:color="BFBFBF" w:sz="4"/>
+              <w:bottom w:val="single" w:color="BFBFBF" w:sz="4"/>
+              <w:right w:val="single" w:color="BFBFBF" w:sz="4"/>
+            </w:tcBorders>
+            <w:shd w:fill="F7F9FC" w:val="clear"/>
+            <w:tcMar>
+              <w:top w:type="dxa" w:w="70"/>
+              <w:left w:type="dxa" w:w="110"/>
+              <w:bottom w:type="dxa" w:w="70"/>
+              <w:right w:type="dxa" w:w="110"/>
+            </w:tcMar>
+          </w:tcPr>
+          <w:p>
+            <w:r>
+              <w:rPr>
+                <w:sz w:val="20"/>
+              </w:rPr>
+              <w:t>Minimo; funciona en cualquier navegador web.</w:t>
+            </w:r>
+          </w:p>
+        </w:tc>
+        <w:tc>
+          <w:tcPr>
+            <w:tcW w:type="dxa" w:w="2100"/>
+            <w:tcBorders>
+              <w:top w:val="single" w:color="BFBFBF" w:sz="4"/>
+              <w:left w:val="single" w:color="BFBFBF" w:sz="4"/>
+              <w:bottom w:val="single" w:color="BFBFBF" w:sz="4"/>
+              <w:right w:val="single" w:color="BFBFBF" w:sz="4"/>
+            </w:tcBorders>
+            <w:shd w:fill="F7F9FC" w:val="clear"/>
+            <w:tcMar>
+              <w:top w:type="dxa" w:w="70"/>
+              <w:left w:type="dxa" w:w="110"/>
+              <w:bottom w:type="dxa" w:w="70"/>
+              <w:right w:type="dxa" w:w="110"/>
+            </w:tcMar>
+          </w:tcPr>
+          <w:p>
+            <w:r>
+              <w:rPr>
+                <w:sz w:val="20"/>
+              </w:rPr>
+              <w:t>Medio-alto; requiere memoria RAM y almacenamiento local para indexar el proyecto.</w:t>
+            </w:r>
+          </w:p>
+        </w:tc>
+      </w:tr>
+      <w:tr>
+        <w:trPr>
+          <w:cantSplit/>
+        </w:trPr>
+        <w:tc>
+          <w:tcPr>
+            <w:tcW w:type="dxa" w:w="1900"/>
+            <w:tcBorders>
+              <w:top w:val="single" w:color="BFBFBF" w:sz="4"/>
+              <w:left w:val="single" w:color="BFBFBF" w:sz="4"/>
+              <w:bottom w:val="single" w:color="BFBFBF" w:sz="4"/>
+              <w:right w:val="single" w:color="BFBFBF" w:sz="4"/>
+            </w:tcBorders>
+            <w:shd w:fill="FFFFFF" w:val="clear"/>
+            <w:tcMar>
+              <w:top w:type="dxa" w:w="70"/>
+              <w:left w:type="dxa" w:w="110"/>
+              <w:bottom w:type="dxa" w:w="70"/>
+              <w:right w:type="dxa" w:w="110"/>
+            </w:tcMar>
+          </w:tcPr>
+          <w:p>
+            <w:r>
+              <w:rPr>
+                <w:sz w:val="20"/>
+              </w:rPr>
+              <w:t>Control de versiones</w:t>
+            </w:r>
+          </w:p>
+        </w:tc>
+        <w:tc>
+          <w:tcPr>
+            <w:tcW w:type="dxa" w:w="5638"/>
+            <w:tcBorders>
+              <w:top w:val="single" w:color="BFBFBF" w:sz="4"/>
+              <w:left w:val="single" w:color="BFBFBF" w:sz="4"/>
+              <w:bottom w:val="single" w:color="BFBFBF" w:sz="4"/>
+              <w:right w:val="single" w:color="BFBFBF" w:sz="4"/>
+            </w:tcBorders>
+            <w:shd w:fill="FFFFFF" w:val="clear"/>
+            <w:tcMar>
+              <w:top w:type="dxa" w:w="70"/>
+              <w:left w:type="dxa" w:w="110"/>
+              <w:bottom w:type="dxa" w:w="70"/>
+              <w:right w:type="dxa" w:w="110"/>
+            </w:tcMar>
+          </w:tcPr>
+          <w:p>
+            <w:r>
+              <w:rPr>
+                <w:sz w:val="20"/>
+              </w:rPr>
+              <w:t>Limitado a exportar o descargar archivos sueltos.</w:t>
+            </w:r>
+          </w:p>
+        </w:tc>
+        <w:tc>
+          <w:tcPr>
+            <w:tcW w:type="dxa" w:w="2100"/>
+            <w:tcBorders>
+              <w:top w:val="single" w:color="BFBFBF" w:sz="4"/>
+              <w:left w:val="single" w:color="BFBFBF" w:sz="4"/>
+              <w:bottom w:val="single" w:color="BFBFBF" w:sz="4"/>
+              <w:right w:val="single" w:color="BFBFBF" w:sz="4"/>
+            </w:tcBorders>
+            <w:shd w:fill="FFFFFF" w:val="clear"/>
+            <w:tcMar>
+              <w:top w:type="dxa" w:w="70"/>
+              <w:left w:type="dxa" w:w="110"/>
+              <w:bottom w:type="dxa" w:w="70"/>
+              <w:right w:type="dxa" w:w="110"/>
+            </w:tcMar>
+          </w:tcPr>
+          <w:p>
+            <w:r>
+              <w:rPr>
+                <w:sz w:val="20"/>
+              </w:rPr>
+              <w:t>Integracion profunda con Git, ramas, control de diferencias visual y GitHub.</w:t>
+            </w:r>
+          </w:p>
+        </w:tc>
+      </w:tr>
+      <w:tr>
+        <w:trPr>
+          <w:cantSplit/>
+        </w:trPr>
+        <w:tc>
+          <w:tcPr>
+            <w:tcW w:type="dxa" w:w="1900"/>
+            <w:tcBorders>
+              <w:top w:val="single" w:color="BFBFBF" w:sz="4"/>
+              <w:left w:val="single" w:color="BFBFBF" w:sz="4"/>
+              <w:bottom w:val="single" w:color="BFBFBF" w:sz="4"/>
+              <w:right w:val="single" w:color="BFBFBF" w:sz="4"/>
+            </w:tcBorders>
+            <w:shd w:fill="FFFFFF" w:val="clear"/>
+            <w:tcMar>
+              <w:top w:type="dxa" w:w="70"/>
+              <w:left w:type="dxa" w:w="110"/>
+              <w:bottom w:type="dxa" w:w="70"/>
+              <w:right w:type="dxa" w:w="110"/>
+            </w:tcMar>
+          </w:tcPr>
+          <w:p>
+            <w:r>
+              <w:rPr>
+                <w:sz w:val="20"/>
+              </w:rPr>
+              <w:t>Personalizacion</w:t>
+            </w:r>
+          </w:p>
+        </w:tc>
+        <w:tc>
+          <w:tcPr>
+            <w:tcW w:type="dxa" w:w="5638"/>
+            <w:tcBorders>
+              <w:top w:val="single" w:color="BFBFBF" w:sz="4"/>
+              <w:left w:val="single" w:color="BFBFBF" w:sz="4"/>
+              <w:bottom w:val="single" w:color="BFBFBF" w:sz="4"/>
+              <w:right w:val="single" w:color="BFBFBF" w:sz="4"/>
+            </w:tcBorders>
+            <w:shd w:fill="FFFFFF" w:val="clear"/>
+            <w:tcMar>
+              <w:top w:type="dxa" w:w="70"/>
+              <w:left w:type="dxa" w:w="110"/>
+              <w:bottom w:type="dxa" w:w="70"/>
+              <w:right w:type="dxa" w:w="110"/>
+            </w:tcMar>
+          </w:tcPr>
+          <w:p>
+            <w:r>
+              <w:rPr>
+                <w:sz w:val="20"/>
+              </w:rPr>
+              <w:t>Escasa o nula; depende de la plataforma web.</w:t>
+            </w:r>
+          </w:p>
+        </w:tc>
+        <w:tc>
+          <w:tcPr>
+            <w:tcW w:type="dxa" w:w="2100"/>
+            <w:tcBorders>
+              <w:top w:val="single" w:color="BFBFBF" w:sz="4"/>
+              <w:left w:val="single" w:color="BFBFBF" w:sz="4"/>
+              <w:bottom w:val="single" w:color="BFBFBF" w:sz="4"/>
+              <w:right w:val="single" w:color="BFBFBF" w:sz="4"/>
+            </w:tcBorders>
+            <w:shd w:fill="FFFFFF" w:val="clear"/>
+            <w:tcMar>
+              <w:top w:type="dxa" w:w="70"/>
+              <w:left w:type="dxa" w:w="110"/>
+              <w:bottom w:type="dxa" w:w="70"/>
+              <w:right w:type="dxa" w:w="110"/>
+            </w:tcMar>
+          </w:tcPr>
+          <w:p>
+            <w:r>
+              <w:rPr>
+                <w:sz w:val="20"/>
+              </w:rPr>
+              <w:t>Elevada; personalizable mediante gestores de paquetes y extensiones de la comunidad.</w:t>
+            </w:r>
+          </w:p>
+        </w:tc>
+      </w:tr>
+    </w:tbl>
+    <w:p>
+      <w:pPr>
+        <w:pStyle w:val="Heading2"/>
+      </w:pPr>
+      <w:r>
+        <w:t>17.6 F. Actividades practicas y ejercicios del criterio 1.6</w:t>
+      </w:r>
+    </w:p>
+    <w:p>
+      <w:pPr>
+        <w:jc w:val="both"/>
+      </w:pPr>
+      <w:r>
+        <w:rPr>
+          <w:b/>
+        </w:rPr>
+        <w:t xml:space="preserve">Actividad de configuracion de entorno. </w:t>
+      </w:r>
+      <w:r>
+        <w:t>Instala un editor modular avanzado (como Visual Studio Code o Cursor) y, para que la experiencia programando solo con JavaScript sea excelente, instala estas tres extensiones especificas:</w:t>
+      </w:r>
+    </w:p>
+    <w:p>
+      <w:pPr>
+        <w:ind w:left="400"/>
+        <w:jc w:val="both"/>
+      </w:pPr>
+      <w:r>
+        <w:t xml:space="preserve">- </w:t>
+      </w:r>
+      <w:r>
+        <w:rPr>
+          <w:b/>
+        </w:rPr>
+        <w:t xml:space="preserve">Live Server (imprescindible para front-end). </w:t>
+      </w:r>
+      <w:r>
+        <w:t>Cuando trabajas con JavaScript puro necesitas enlazar tu archivo .js a un index.html. Live Server crea un servidor web local en tu computadora con un solo clic: cada vez que cambies tu codigo JavaScript u HTML y guardes, la pagina del navegador se recargara automaticamente. Ya no habra que abrir el archivo desde la carpeta ni pulsar F5 constantemente.</w:t>
+      </w:r>
+    </w:p>
+    <w:p>
+      <w:pPr>
+        <w:ind w:left="400"/>
+        <w:jc w:val="both"/>
+      </w:pPr>
+      <w:r>
+        <w:t xml:space="preserve">- </w:t>
+      </w:r>
+      <w:r>
+        <w:rPr>
+          <w:b/>
+        </w:rPr>
+        <w:t xml:space="preserve">Quokka.js (tu bloc de notas interactivo). </w:t>
+      </w:r>
+      <w:r>
+        <w:t>Ejecuta tu codigo JavaScript en tiempo real mientras lo vas escribiendo, directamente dentro del editor. Si creas una funcion o una operacion matematica, Quokka muestra el resultado flotando justo al lado de la linea de codigo, sin abrir el navegador ni la terminal. Ideal para probar logica rapido.</w:t>
+      </w:r>
+    </w:p>
+    <w:p>
+      <w:pPr>
+        <w:ind w:left="400"/>
+        <w:jc w:val="both"/>
+      </w:pPr>
+      <w:r>
+        <w:t xml:space="preserve">- </w:t>
+      </w:r>
+      <w:r>
+        <w:rPr>
+          <w:b/>
+        </w:rPr>
+        <w:t xml:space="preserve">Error Lens (deteccion visual inmediata). </w:t>
+      </w:r>
+      <w:r>
+        <w:t>Normalmente, cuando te equivocas en JavaScript (por ejemplo, te falta un parentesis o escribes mal el nombre de una variable), el editor te pone una linea ondulada roja muy pequena debajo del error. Error Lens toma ese mensaje y lo escribe en texto completo con fondo rojo directamente al final de la linea, para que veas instantaneamente que esta fallando sin tener que pasar el cursor por encima.</w:t>
+      </w:r>
+    </w:p>
+    <w:p>
+      <w:pPr>
+        <w:jc w:val="both"/>
+      </w:pPr>
+      <w:r>
+        <w:t>Las tres extensiones resuelven problemas distintos sobre el mismo archivo:</w:t>
+      </w:r>
+      <w:r/>
+    </w:p>
+    <w:p>
+      <w:pPr>
+        <w:shd w:val="clear" w:color="auto" w:fill="F3F3F3"/>
+      </w:pPr>
+      <w:r>
+        <w:rPr>
+          <w:rFonts w:ascii="Consolas" w:hAnsi="Consolas"/>
+          <w:sz w:val="18"/>
+        </w:rPr>
+        <w:t>// Quokka.js: evalua en vivo y muestra el resultado a la derecha de la linea</w:t>
+      </w:r>
+    </w:p>
+    <w:p>
+      <w:pPr>
+        <w:shd w:val="clear" w:color="auto" w:fill="F3F3F3"/>
+      </w:pPr>
+      <w:r>
+        <w:rPr>
+          <w:rFonts w:ascii="Consolas" w:hAnsi="Consolas"/>
+          <w:sz w:val="18"/>
+        </w:rPr>
+        <w:t>const sumar = (a, b) =&gt; a + b;</w:t>
+      </w:r>
+    </w:p>
+    <w:p>
+      <w:pPr>
+        <w:shd w:val="clear" w:color="auto" w:fill="F3F3F3"/>
+      </w:pPr>
+      <w:r>
+        <w:rPr>
+          <w:rFonts w:ascii="Consolas" w:hAnsi="Consolas"/>
+          <w:sz w:val="18"/>
+        </w:rPr>
+      </w:r>
+    </w:p>
+    <w:p>
+      <w:pPr>
+        <w:shd w:val="clear" w:color="auto" w:fill="F3F3F3"/>
+      </w:pPr>
+      <w:r>
+        <w:rPr>
+          <w:rFonts w:ascii="Consolas" w:hAnsi="Consolas"/>
+          <w:sz w:val="18"/>
+        </w:rPr>
+        <w:t>sumar(5, 6);</w:t>
+      </w:r>
+    </w:p>
+    <w:p>
+      <w:pPr>
+        <w:shd w:val="clear" w:color="auto" w:fill="F3F3F3"/>
+      </w:pPr>
+      <w:r>
+        <w:rPr>
+          <w:rFonts w:ascii="Consolas" w:hAnsi="Consolas"/>
+          <w:sz w:val="18"/>
+        </w:rPr>
+        <w:t>// -&gt; 11     (esto es lo que Quokka dibuja flotante; el navegador no interviene)</w:t>
+      </w:r>
+    </w:p>
+    <w:p>
+      <w:pPr>
+        <w:shd w:val="clear" w:color="auto" w:fill="F3F3F3"/>
+      </w:pPr>
+      <w:r>
+        <w:rPr>
+          <w:rFonts w:ascii="Consolas" w:hAnsi="Consolas"/>
+          <w:sz w:val="18"/>
+        </w:rPr>
+      </w:r>
+    </w:p>
+    <w:p>
+      <w:pPr>
+        <w:shd w:val="clear" w:color="auto" w:fill="F3F3F3"/>
+      </w:pPr>
+      <w:r>
+        <w:rPr>
+          <w:rFonts w:ascii="Consolas" w:hAnsi="Consolas"/>
+          <w:sz w:val="18"/>
+        </w:rPr>
+        <w:t>// Live Server: recarga el navegador al guardar</w:t>
+      </w:r>
+    </w:p>
+    <w:p>
+      <w:pPr>
+        <w:shd w:val="clear" w:color="auto" w:fill="F3F3F3"/>
+      </w:pPr>
+      <w:r>
+        <w:rPr>
+          <w:rFonts w:ascii="Consolas" w:hAnsi="Consolas"/>
+          <w:sz w:val="18"/>
+        </w:rPr>
+        <w:t>&lt;script src="./js/logica.js"&gt;&lt;/script&gt;</w:t>
+      </w:r>
+    </w:p>
+    <w:p>
+      <w:pPr>
+        <w:shd w:val="clear" w:color="auto" w:fill="F3F3F3"/>
+      </w:pPr>
+      <w:r>
+        <w:rPr>
+          <w:rFonts w:ascii="Consolas" w:hAnsi="Consolas"/>
+          <w:sz w:val="18"/>
+        </w:rPr>
+      </w:r>
+    </w:p>
+    <w:p>
+      <w:pPr>
+        <w:shd w:val="clear" w:color="auto" w:fill="F3F3F3"/>
+      </w:pPr>
+      <w:r>
+        <w:rPr>
+          <w:rFonts w:ascii="Consolas" w:hAnsi="Consolas"/>
+          <w:sz w:val="18"/>
+        </w:rPr>
+        <w:t>// Error Lens: marca la linea entera si el id no existe</w:t>
+      </w:r>
+    </w:p>
+    <w:p>
+      <w:pPr>
+        <w:shd w:val="clear" w:color="auto" w:fill="F3F3F3"/>
+      </w:pPr>
+      <w:r>
+        <w:rPr>
+          <w:rFonts w:ascii="Consolas" w:hAnsi="Consolas"/>
+          <w:sz w:val="18"/>
+        </w:rPr>
+        <w:t>const boton = document.getElementById('btn');</w:t>
+      </w:r>
+    </w:p>
+    <w:p>
+      <w:pPr>
+        <w:pStyle w:val="Heading2"/>
+      </w:pPr>
+      <w:r>
+        <w:t>17.7 Errores frecuentes al trabajar con estas herramientas</w:t>
+      </w:r>
+    </w:p>
+    <w:p>
+      <w:pPr>
+        <w:jc w:val="both"/>
+      </w:pPr>
+      <w:r>
+        <w:t>Estos son los fallos que mas se repiten al usar editores, DevTools y entornos online, y que son objeto habitual de pregunta en las pruebas:</w:t>
+      </w:r>
+    </w:p>
+    <w:p>
+      <w:pPr>
+        <w:ind w:left="400"/>
+        <w:jc w:val="both"/>
+      </w:pPr>
+      <w:r>
+        <w:t xml:space="preserve">- </w:t>
+      </w:r>
+      <w:r>
+        <w:rPr>
+          <w:b/>
+        </w:rPr>
+        <w:t xml:space="preserve">Guardar sin guardar de verdad. </w:t>
+      </w:r>
+      <w:r>
+        <w:t>Live Server y Error Lens vigilan el archivo en disco. Si el editor tiene cambios sin guardar, el navegador recarga la version anterior y parece que el cambio no se aplica.</w:t>
+      </w:r>
+    </w:p>
+    <w:p>
+      <w:pPr>
+        <w:ind w:left="400"/>
+        <w:jc w:val="both"/>
+      </w:pPr>
+      <w:r>
+        <w:t xml:space="preserve">- </w:t>
+      </w:r>
+      <w:r>
+        <w:rPr>
+          <w:b/>
+        </w:rPr>
+        <w:t xml:space="preserve">Abrir el documento con doble clic. </w:t>
+      </w:r>
+      <w:r>
+        <w:t>Un index.html abierto como file:// sufre las restricciones de seguridad del navegador (politica de origen unico) y no permite cargar correctamente algunos recursos ni usar fetch(). Para el apartado 1.5 y para las extensiones hay que usar un servidor local.</w:t>
+      </w:r>
+    </w:p>
+    <w:p>
+      <w:pPr>
+        <w:ind w:left="400"/>
+        <w:jc w:val="both"/>
+      </w:pPr>
+      <w:r>
+        <w:t xml:space="preserve">- </w:t>
+      </w:r>
+      <w:r>
+        <w:rPr>
+          <w:b/>
+        </w:rPr>
+        <w:t xml:space="preserve">404 en el panel Network. </w:t>
+      </w:r>
+      <w:r>
+        <w:t>La ruta del atributo src es incorrecta o el fichero no existe en esa carpeta. En un proyecto bien organizado la ruta incluye la carpeta: ./js/logica.js</w:t>
+      </w:r>
+    </w:p>
+    <w:p>
+      <w:pPr>
+        <w:ind w:left="400"/>
+        <w:jc w:val="both"/>
+      </w:pPr>
+      <w:r>
+        <w:t xml:space="preserve">- </w:t>
+      </w:r>
+      <w:r>
+        <w:rPr>
+          <w:b/>
+        </w:rPr>
+        <w:t xml:space="preserve">Confundir la consola con la pagina. </w:t>
+      </w:r>
+      <w:r>
+        <w:t>console.log() escribe en el panel Consola, que el usuario final no ve. Si el ejercicio pide que el texto se vea en la pagina, hay que usar innerHTML, textContent o document.write().</w:t>
+      </w:r>
+    </w:p>
+    <w:p>
+      <w:pPr>
+        <w:ind w:left="400"/>
+        <w:jc w:val="both"/>
+      </w:pPr>
+      <w:r>
+        <w:t xml:space="preserve">- </w:t>
+      </w:r>
+      <w:r>
+        <w:rPr>
+          <w:b/>
+        </w:rPr>
+        <w:t xml:space="preserve">Breakpoint en una linea que no llega a ejecutarse. </w:t>
+      </w:r>
+      <w:r>
+        <w:t>El panel Sources congela el script solo si la ejecucion pasa por esa linea. Si esta dentro de un if que no se cumple, el punto de interrupcion nunca se alcanza.</w:t>
+      </w:r>
+    </w:p>
+    <w:p>
+      <w:pPr>
+        <w:ind w:left="400"/>
+        <w:jc w:val="both"/>
+      </w:pPr>
+      <w:r>
+        <w:t xml:space="preserve">- </w:t>
+      </w:r>
+      <w:r>
+        <w:rPr>
+          <w:b/>
+        </w:rPr>
+        <w:t xml:space="preserve">Poblar una base de datos desde el navegador. </w:t>
+      </w:r>
+      <w:r>
+        <w:t>Las plataformas online son para prototipos. Una clave de API o una base de datos expuestos en el cliente son publicos: el usuario puede leerlos con F12.</w:t>
+      </w:r>
+    </w:p>
+    <w:p>
+      <w:pPr>
+        <w:ind w:left="400"/>
+        <w:jc w:val="both"/>
+      </w:pPr>
+      <w:r>
+        <w:t xml:space="preserve">- </w:t>
+      </w:r>
+      <w:r>
+        <w:rPr>
+          <w:b/>
+        </w:rPr>
+        <w:t xml:space="preserve">Plantear que un editor ligero sirve para un framework. </w:t>
+      </w:r>
+      <w:r>
+        <w:t>Notepad++ o un editor online pueden escribir un script suelto, pero no indexan un proyecto con React o Angular ni gestionan dependencias: para eso hace falta un IDE.</w:t>
+      </w:r>
+    </w:p>
+    <w:p>
+      <w:pPr>
+        <w:pStyle w:val="Heading1"/>
         <w:pageBreakBefore/>
       </w:pPr>
       <w:r>
@@ -32559,6 +33958,94 @@
     </w:p>
     <w:p>
       <w:pPr>
+        <w:pStyle w:val="Heading3"/>
+      </w:pPr>
+      <w:r>
+        <w:t>Errores del apartado 1.6</w:t>
+      </w:r>
+    </w:p>
+    <w:p>
+      <w:pPr>
+        <w:jc w:val="both"/>
+      </w:pPr>
+      <w:r>
+        <w:t>Los errores del punto 17.7 se resumen aqui junto con su sintoma tipico:</w:t>
+      </w:r>
+    </w:p>
+    <w:p>
+      <w:pPr>
+        <w:ind w:left="400"/>
+        <w:jc w:val="both"/>
+      </w:pPr>
+      <w:r>
+        <w:t xml:space="preserve">- </w:t>
+      </w:r>
+      <w:r>
+        <w:rPr>
+          <w:b/>
+        </w:rPr>
+        <w:t xml:space="preserve">Olvidar defer o async en un script externo del head. </w:t>
+      </w:r>
+      <w:r>
+        <w:t>Sintoma: la pagina tarda en aparecer o el script se ejecuta antes de que exista el DOM. Causa: sin esos atributos el navegador detiene el analisis del HTML hasta que el script se ejecuta. Solucion: anadir defer (se ejecuta al terminar el parseo) o async (se ejecuta en cuanto termina la descarga).</w:t>
+      </w:r>
+    </w:p>
+    <w:p>
+      <w:pPr>
+        <w:ind w:left="400"/>
+        <w:jc w:val="both"/>
+      </w:pPr>
+      <w:r>
+        <w:t xml:space="preserve">- </w:t>
+      </w:r>
+      <w:r>
+        <w:rPr>
+          <w:b/>
+        </w:rPr>
+        <w:t xml:space="preserve">Se carga un .js desde file:// en lugar de un servidor local. </w:t>
+      </w:r>
+      <w:r>
+        <w:t>Sintoma: aparece un 404 en Network aunque el fichero este en la misma carpeta. Causa: rutas relativas mal resueltas o bloqueo por origen unico. Solucion: usar ./js/logica.js y Live Server.</w:t>
+      </w:r>
+    </w:p>
+    <w:p>
+      <w:pPr>
+        <w:ind w:left="400"/>
+        <w:jc w:val="both"/>
+      </w:pPr>
+      <w:r>
+        <w:t xml:space="preserve">- </w:t>
+      </w:r>
+      <w:r>
+        <w:rPr>
+          <w:b/>
+        </w:rPr>
+        <w:t xml:space="preserve">Se espera ver console.log() en la pagina. </w:t>
+      </w:r>
+      <w:r>
+        <w:t>Sintoma: el ejercicio parece no funcionar aunque el codigo sea correcto. Causa: console.log escribe en la consola del navegador, no en el DOM. Solucion: textContent o innerHTML.</w:t>
+      </w:r>
+    </w:p>
+    <w:p>
+      <w:pPr>
+        <w:ind w:left="400"/>
+        <w:jc w:val="both"/>
+      </w:pPr>
+      <w:r>
+        <w:t xml:space="preserve">- </w:t>
+      </w:r>
+      <w:r>
+        <w:rPr>
+          <w:b/>
+        </w:rPr>
+        <w:t xml:space="preserve">No se comprueba el codigo de estado en Network. </w:t>
+      </w:r>
+      <w:r>
+        <w:t>Sintoma: 404 Not Found al cargar el .js. Solucion: el fichero debe devolver 200 OK; un 404 significa ruta o nombre incorrectos.</w:t>
+      </w:r>
+    </w:p>
+    <w:p>
+      <w:pPr>
         <w:pStyle w:val="Heading1"/>
       </w:pPr>
       <w:r>
@@ -32973,6 +34460,186 @@
       </w:r>
       <w:r>
         <w:t xml:space="preserve">Cross-Site Scripting: ataque que inyecta código malicioso en páginas vistas por otros usuarios.</w:t>
+      </w:r>
+    </w:p>
+    <w:p>
+      <w:r>
+        <w:rPr>
+          <w:b/>
+          <w:color w:val="1F3864"/>
+        </w:rPr>
+        <w:t xml:space="preserve">Editor: </w:t>
+      </w:r>
+      <w:r>
+        <w:t>Programa de edicion de texto. Un editor basico solo escribe; un IDE anade depuracion, gestion de dependencias y control de versiones.</w:t>
+      </w:r>
+    </w:p>
+    <w:p>
+      <w:r>
+        <w:rPr>
+          <w:b/>
+          <w:color w:val="1F3864"/>
+        </w:rPr>
+        <w:t xml:space="preserve">IDE: </w:t>
+      </w:r>
+      <w:r>
+        <w:t>Integrated Development Environment: entorno de desarrollo completo, con depurador, refactorizacion e indexacion del proyecto.</w:t>
+      </w:r>
+    </w:p>
+    <w:p>
+      <w:r>
+        <w:rPr>
+          <w:b/>
+          <w:color w:val="1F3864"/>
+        </w:rPr>
+        <w:t xml:space="preserve">VSCodium: </w:t>
+      </w:r>
+      <w:r>
+        <w:t>Compilacion limpia del codigo fuente de VS Code, sin telemetria ni licencia comercial de Microsoft.</w:t>
+      </w:r>
+    </w:p>
+    <w:p>
+      <w:r>
+        <w:rPr>
+          <w:b/>
+          <w:color w:val="1F3864"/>
+        </w:rPr>
+        <w:t xml:space="preserve">Extension: </w:t>
+      </w:r>
+      <w:r>
+        <w:t>Complemento que se instala en un editor para anadir funcionalidad, como ESLint, Prettier o los Snippets de React y Vue.</w:t>
+      </w:r>
+    </w:p>
+    <w:p>
+      <w:r>
+        <w:rPr>
+          <w:b/>
+          <w:color w:val="1F3864"/>
+        </w:rPr>
+        <w:t xml:space="preserve">Live Server: </w:t>
+      </w:r>
+      <w:r>
+        <w:t>Extension de VS Code que levanta un servidor web local y recarga el navegador cada vez que se guarda un archivo.</w:t>
+      </w:r>
+    </w:p>
+    <w:p>
+      <w:r>
+        <w:rPr>
+          <w:b/>
+          <w:color w:val="1F3864"/>
+        </w:rPr>
+        <w:t xml:space="preserve">Quokka.js: </w:t>
+      </w:r>
+      <w:r>
+        <w:t>Extension que ejecuta JavaScript en tiempo real dentro del editor y muestra el resultado junto a la linea de codigo.</w:t>
+      </w:r>
+    </w:p>
+    <w:p>
+      <w:r>
+        <w:rPr>
+          <w:b/>
+          <w:color w:val="1F3864"/>
+        </w:rPr>
+        <w:t xml:space="preserve">Error Lens: </w:t>
+      </w:r>
+      <w:r>
+        <w:t>Extension que convierte la marca de error de una linea en un mensaje completo con fondo rojo, visible sin pasar el raton por encima.</w:t>
+      </w:r>
+    </w:p>
+    <w:p>
+      <w:r>
+        <w:rPr>
+          <w:b/>
+          <w:color w:val="1F3864"/>
+        </w:rPr>
+        <w:t xml:space="preserve">Coding Ground: </w:t>
+      </w:r>
+      <w:r>
+        <w:t>Editor de JavaScript en la nube de Tutorialspoint, con Preview y consola de ejecucion simultaneas.</w:t>
+      </w:r>
+    </w:p>
+    <w:p>
+      <w:r>
+        <w:rPr>
+          <w:b/>
+          <w:color w:val="1F3864"/>
+        </w:rPr>
+        <w:t xml:space="preserve">CodeSandbox, StackBlitz y JSFiddle: </w:t>
+      </w:r>
+      <w:r>
+        <w:t>Entornos online que permiten arrancar proyectos de frameworks sin instalar nada en el equipo.</w:t>
+      </w:r>
+    </w:p>
+    <w:p>
+      <w:r>
+        <w:rPr>
+          <w:b/>
+          <w:color w:val="1F3864"/>
+        </w:rPr>
+        <w:t xml:space="preserve">Breakpoint: </w:t>
+      </w:r>
+      <w:r>
+        <w:t>Punto de interrupcion: marca en una linea donde el depurador congela la ejecucion para inspeccionar variables y la pila de llamadas.</w:t>
+      </w:r>
+    </w:p>
+    <w:p>
+      <w:r>
+        <w:rPr>
+          <w:b/>
+          <w:color w:val="1F3864"/>
+        </w:rPr>
+        <w:t xml:space="preserve">Call Stack: </w:t>
+      </w:r>
+      <w:r>
+        <w:t>Pila de llamadas: cadena de funciones que se estan ejecutando en ese momento.</w:t>
+      </w:r>
+    </w:p>
+    <w:p>
+      <w:r>
+        <w:rPr>
+          <w:b/>
+          <w:color w:val="1F3864"/>
+        </w:rPr>
+        <w:t xml:space="preserve">Git: </w:t>
+      </w:r>
+      <w:r>
+        <w:t>Sistema de control de versiones distribuido que registra el historial de cambios de los archivos de un proyecto.</w:t>
+      </w:r>
+    </w:p>
+    <w:p>
+      <w:r>
+        <w:rPr>
+          <w:b/>
+          <w:color w:val="1F3864"/>
+        </w:rPr>
+        <w:t xml:space="preserve">GitHub: </w:t>
+      </w:r>
+      <w:r>
+        <w:t>Plataforma en la nube que aloja repositorios Git y ofrece issues, pull requests e integracion continua.</w:t>
+      </w:r>
+    </w:p>
+    <w:p>
+      <w:r>
+        <w:rPr>
+          <w:b/>
+          <w:color w:val="1F3864"/>
+        </w:rPr>
+        <w:t xml:space="preserve">Pull request: </w:t>
+      </w:r>
+      <w:r>
+        <w:t>Mecanismo de GitHub para proponer cambios y pedir revision antes de integrarlos en la rama principal.</w:t>
+      </w:r>
+    </w:p>
+    <w:p>
+      <w:r>
+        <w:rPr>
+          <w:b/>
+          <w:color w:val="1F3864"/>
+        </w:rPr>
+        <w:t xml:space="preserve">Telemetria: </w:t>
+      </w:r>
+      <w:r>
+        <w:t>Envio de datos de uso de un programa a su proveedor. Es la diferencia principal entre VS Code y VSCodium.</w:t>
       </w:r>
     </w:p>
     <w:sectPr>

</xml_diff>